<commit_message>
Unify JARVIS-X into DISHA Brain platform
</commit_message>
<xml_diff>
--- a/docs/DISHA_JARVIS_X_TDD.docx
+++ b/docs/DISHA_JARVIS_X_TDD.docx
@@ -194,7 +194,7 @@
     </w:p>
     <w:p>
       <w:r>
-        <w:t>This document unifies the architecture of the DISHA repository and the JARVIS-X platform into a single technical design reference. DISHA is treated as a monorepo under consolidation. JARVIS-X is treated as the target orchestration architecture that brings reasoning, execution, memory, security, monitoring, and deception-aware telemetry into one coherent system.</w:t>
+        <w:t>This document unifies the architecture of the DISHA repository and the JARVIS-X platform into a single technical design reference. DISHA is treated as a single platform under consolidation. JARVIS-X is treated as the target orchestration architecture that brings reasoning, execution, memory, security, monitoring, and deception-aware telemetry into one coherent system.</w:t>
       </w:r>
     </w:p>
     <w:p>
@@ -210,7 +210,7 @@
         <w:pStyle w:val="ListBullet"/>
       </w:pPr>
       <w:r>
-        <w:t>JARVIS-X contributes the bounded multi-brain architecture and the additive product workspace under `jarvis-x/`.</w:t>
+        <w:t>JARVIS-X contributes the bounded multi-brain architecture and the additive product workspace under `disha/`.</w:t>
       </w:r>
     </w:p>
     <w:p>
@@ -405,7 +405,7 @@
           </w:tcPr>
           <w:p>
             <w:r>
-              <w:t>jarvis-x/</w:t>
+              <w:t>disha/</w:t>
             </w:r>
           </w:p>
         </w:tc>
@@ -1019,7 +1019,7 @@
           </w:tcPr>
           <w:p>
             <w:r>
-              <w:t>`jarvis-x/backend/*`, `jarvis-x/agent/*`, `jarvis-x/mobile/*`</w:t>
+              <w:t>`disha/brain/*`, `disha/edge_agent/*`, `disha/mobile/*`</w:t>
             </w:r>
           </w:p>
         </w:tc>
@@ -1643,7 +1643,7 @@
         <w:pStyle w:val="ListBullet"/>
       </w:pPr>
       <w:r>
-        <w:t>Container run: backend and agent through `jarvis-x/docker-compose.yml`</w:t>
+        <w:t>Container run: backend and agent through `disha/docker-compose.yml`</w:t>
       </w:r>
     </w:p>
     <w:p>

</xml_diff>